<commit_message>
Informe final con autor y figuras de la Entrega 3; evidencia de seguridad
- Portada con David Antonio Méndez Estrada (carné 090-22-3128).
- Las 7 figuras embebidas (incluidas Grafana, Zero Trust y DDoS 5G de la Entrega 3).
- Capturas de pantalla y bitácoras de las pruebas de seguridad (zerotrust, ddos5g, SIEM).

Co-Authored-By: Claude Opus 4.8 <noreply@anthropic.com>
</commit_message>
<xml_diff>
--- a/informe/Informe_NetCloud-Secure.docx
+++ b/informe/Informe_NetCloud-Secure.docx
@@ -133,7 +133,7 @@
           <w:sz w:val="24"/>
           <w:szCs w:val="24"/>
         </w:rPr>
-        <w:t xml:space="preserve">[Nombre del estudiante]</w:t>
+        <w:t xml:space="preserve">David Antonio Méndez Estrada</w:t>
       </w:r>
     </w:p>
     <w:p>
@@ -147,7 +147,7 @@
           <w:sz w:val="24"/>
           <w:szCs w:val="24"/>
         </w:rPr>
-        <w:t xml:space="preserve">Carné: [Carné]</w:t>
+        <w:t xml:space="preserve">Carné: 090-22-3128</w:t>
       </w:r>
     </w:p>
     <w:p>
@@ -4788,24 +4788,53 @@
     </w:p>
     <w:p>
       <w:pPr>
-        <w:spacing w:before="120" w:line="480"/>
+        <w:spacing w:before="120" w:line="240"/>
         <w:jc w:val="center"/>
       </w:pPr>
       <w:r>
-        <w:rPr>
-          <w:rFonts w:ascii="Times New Roman" w:cs="Times New Roman" w:eastAsia="Times New Roman" w:hAnsi="Times New Roman"/>
-          <w:i/>
-          <w:iCs/>
-          <w:color w:val="888888"/>
-          <w:sz w:val="24"/>
-          <w:szCs w:val="24"/>
-        </w:rPr>
-        <w:t xml:space="preserve">[Insertar captura: grafana.png]</w:t>
-      </w:r>
-    </w:p>
-    <w:p>
-      <w:pPr>
-        <w:spacing w:after="120" w:line="480"/>
+        <w:drawing>
+          <wp:inline distT="0" distB="0" distL="0" distR="0">
+            <wp:extent cx="5334000" cy="2552700"/>
+            <wp:effectExtent t="0" r="0" b="0" l="0"/>
+            <wp:docPr id="5" name=""/>
+            <wp:cNvGraphicFramePr>
+              <a:graphicFrameLocks xmlns:a="http://schemas.openxmlformats.org/drawingml/2006/main" noChangeAspect="1"/>
+            </wp:cNvGraphicFramePr>
+            <a:graphic xmlns:a="http://schemas.openxmlformats.org/drawingml/2006/main">
+              <a:graphicData uri="http://schemas.openxmlformats.org/drawingml/2006/picture">
+                <pic:pic xmlns:pic="http://schemas.openxmlformats.org/drawingml/2006/picture">
+                  <pic:nvPicPr>
+                    <pic:cNvPr id="0" name="" descr=""/>
+                    <pic:cNvPicPr>
+                      <a:picLocks noChangeAspect="1" noChangeArrowheads="1"/>
+                    </pic:cNvPicPr>
+                  </pic:nvPicPr>
+                  <pic:blipFill>
+                    <a:blip r:embed="rId12" cstate="none"/>
+                    <a:srcRect/>
+                    <a:stretch>
+                      <a:fillRect/>
+                    </a:stretch>
+                  </pic:blipFill>
+                  <pic:spPr bwMode="auto">
+                    <a:xfrm>
+                      <a:off x="0" y="0"/>
+                      <a:ext cx="5334000" cy="2552700"/>
+                    </a:xfrm>
+                    <a:prstGeom prst="rect">
+                      <a:avLst/>
+                    </a:prstGeom>
+                  </pic:spPr>
+                </pic:pic>
+              </a:graphicData>
+            </a:graphic>
+          </wp:inline>
+        </w:drawing>
+      </w:r>
+    </w:p>
+    <w:p>
+      <w:pPr>
+        <w:spacing w:after="160" w:line="240"/>
         <w:jc w:val="center"/>
       </w:pPr>
       <w:r>
@@ -4905,24 +4934,53 @@
     </w:p>
     <w:p>
       <w:pPr>
-        <w:spacing w:before="120" w:line="480"/>
+        <w:spacing w:before="120" w:line="240"/>
         <w:jc w:val="center"/>
       </w:pPr>
       <w:r>
-        <w:rPr>
-          <w:rFonts w:ascii="Times New Roman" w:cs="Times New Roman" w:eastAsia="Times New Roman" w:hAnsi="Times New Roman"/>
-          <w:i/>
-          <w:iCs/>
-          <w:color w:val="888888"/>
-          <w:sz w:val="24"/>
-          <w:szCs w:val="24"/>
-        </w:rPr>
-        <w:t xml:space="preserve">[Insertar captura: zerotrust.png]</w:t>
-      </w:r>
-    </w:p>
-    <w:p>
-      <w:pPr>
-        <w:spacing w:after="120" w:line="480"/>
+        <w:drawing>
+          <wp:inline distT="0" distB="0" distL="0" distR="0">
+            <wp:extent cx="5334000" cy="4067175"/>
+            <wp:effectExtent t="0" r="0" b="0" l="0"/>
+            <wp:docPr id="6" name=""/>
+            <wp:cNvGraphicFramePr>
+              <a:graphicFrameLocks xmlns:a="http://schemas.openxmlformats.org/drawingml/2006/main" noChangeAspect="1"/>
+            </wp:cNvGraphicFramePr>
+            <a:graphic xmlns:a="http://schemas.openxmlformats.org/drawingml/2006/main">
+              <a:graphicData uri="http://schemas.openxmlformats.org/drawingml/2006/picture">
+                <pic:pic xmlns:pic="http://schemas.openxmlformats.org/drawingml/2006/picture">
+                  <pic:nvPicPr>
+                    <pic:cNvPr id="0" name="" descr=""/>
+                    <pic:cNvPicPr>
+                      <a:picLocks noChangeAspect="1" noChangeArrowheads="1"/>
+                    </pic:cNvPicPr>
+                  </pic:nvPicPr>
+                  <pic:blipFill>
+                    <a:blip r:embed="rId13" cstate="none"/>
+                    <a:srcRect/>
+                    <a:stretch>
+                      <a:fillRect/>
+                    </a:stretch>
+                  </pic:blipFill>
+                  <pic:spPr bwMode="auto">
+                    <a:xfrm>
+                      <a:off x="0" y="0"/>
+                      <a:ext cx="5334000" cy="4067175"/>
+                    </a:xfrm>
+                    <a:prstGeom prst="rect">
+                      <a:avLst/>
+                    </a:prstGeom>
+                  </pic:spPr>
+                </pic:pic>
+              </a:graphicData>
+            </a:graphic>
+          </wp:inline>
+        </w:drawing>
+      </w:r>
+    </w:p>
+    <w:p>
+      <w:pPr>
+        <w:spacing w:after="160" w:line="240"/>
         <w:jc w:val="center"/>
       </w:pPr>
       <w:r>
@@ -4972,24 +5030,53 @@
     </w:p>
     <w:p>
       <w:pPr>
-        <w:spacing w:before="120" w:line="480"/>
+        <w:spacing w:before="120" w:line="240"/>
         <w:jc w:val="center"/>
       </w:pPr>
       <w:r>
-        <w:rPr>
-          <w:rFonts w:ascii="Times New Roman" w:cs="Times New Roman" w:eastAsia="Times New Roman" w:hAnsi="Times New Roman"/>
-          <w:i/>
-          <w:iCs/>
-          <w:color w:val="888888"/>
-          <w:sz w:val="24"/>
-          <w:szCs w:val="24"/>
-        </w:rPr>
-        <w:t xml:space="preserve">[Insertar captura: ddos5g.png]</w:t>
-      </w:r>
-    </w:p>
-    <w:p>
-      <w:pPr>
-        <w:spacing w:after="120" w:line="480"/>
+        <w:drawing>
+          <wp:inline distT="0" distB="0" distL="0" distR="0">
+            <wp:extent cx="5334000" cy="2657475"/>
+            <wp:effectExtent t="0" r="0" b="0" l="0"/>
+            <wp:docPr id="7" name=""/>
+            <wp:cNvGraphicFramePr>
+              <a:graphicFrameLocks xmlns:a="http://schemas.openxmlformats.org/drawingml/2006/main" noChangeAspect="1"/>
+            </wp:cNvGraphicFramePr>
+            <a:graphic xmlns:a="http://schemas.openxmlformats.org/drawingml/2006/main">
+              <a:graphicData uri="http://schemas.openxmlformats.org/drawingml/2006/picture">
+                <pic:pic xmlns:pic="http://schemas.openxmlformats.org/drawingml/2006/picture">
+                  <pic:nvPicPr>
+                    <pic:cNvPr id="0" name="" descr=""/>
+                    <pic:cNvPicPr>
+                      <a:picLocks noChangeAspect="1" noChangeArrowheads="1"/>
+                    </pic:cNvPicPr>
+                  </pic:nvPicPr>
+                  <pic:blipFill>
+                    <a:blip r:embed="rId14" cstate="none"/>
+                    <a:srcRect/>
+                    <a:stretch>
+                      <a:fillRect/>
+                    </a:stretch>
+                  </pic:blipFill>
+                  <pic:spPr bwMode="auto">
+                    <a:xfrm>
+                      <a:off x="0" y="0"/>
+                      <a:ext cx="5334000" cy="2657475"/>
+                    </a:xfrm>
+                    <a:prstGeom prst="rect">
+                      <a:avLst/>
+                    </a:prstGeom>
+                  </pic:spPr>
+                </pic:pic>
+              </a:graphicData>
+            </a:graphic>
+          </wp:inline>
+        </w:drawing>
+      </w:r>
+    </w:p>
+    <w:p>
+      <w:pPr>
+        <w:spacing w:after="160" w:line="240"/>
         <w:jc w:val="center"/>
       </w:pPr>
       <w:r>

</xml_diff>